<commit_message>
Make FAITH-Detect a standalone project (remove predecessor references)
- Reframe README + SRS as original work: drop "methodologically-corrected reimplementation"
  and the prior-project flaw matrix; SRS §3 is now a standalone Design-Rationale table (R1-R12).
- Scrub "fixes flaw F#"/"the old project" comments from the package; reword as positive design
  statements. Correct the cross-domain claim to the honest trade-off throughout.
- Self-contained data: default path is now data/all_data.csv (was an external folder); README
  documents the MAiDE-up source. Setup no longer references any external venv.
- Regenerate the paper draft.
</commit_message>
<xml_diff>
--- a/paper/FAITH-Detect.docx
+++ b/paper/FAITH-Detect.docx
@@ -1965,7 +1965,7 @@
         <w:rPr>
           <w:i w:val="0"/>
         </w:rPr>
-        <w:t>Faithfulness is comparable across variants and mixed in direction; Hard-Mask is strongest on sufficiency and insertion. The headline explanation result is qualitative and structural: explanations are content-only by construction (Figure 8), replacing the fabricated illustrations of prior work.</w:t>
+        <w:t>Faithfulness is comparable across variants and mixed in direction; Hard-Mask is strongest on sufficiency and insertion. The headline explanation result is qualitative and structural: explanations are content-only by construction (Figure 8), computed on the deployed model rather than a surrogate.</w:t>
       </w:r>
     </w:p>
     <w:p>
@@ -2032,7 +2032,7 @@
         <w:rPr>
           <w:i w:val="0"/>
         </w:rPr>
-        <w:t>Our results give a nuanced answer to the motivating question. Making a detector ignore function words is free in-distribution, yields a provable invariance and the best robustness to text attacks, and produces explanations that are content-only by construction — a direct remedy to post-hoc, surrogate-based, or fabricated explanations. The cost is cross-domain transfer: when the content vocabulary changes, function-word and stylistic regularities that the constrained model discards turn out to carry domain-general signal. Practically, hard masking is attractive where robustness, auditability and a guarantee matter and the domain is fixed; the unconstrained or soft model is preferable for open-domain transfer. Limitations: English only; a single in-domain generator (GPT-4), so cross-generator evidence comes from a benchmark that also shifts domain; and a modest in-domain set. Isolating cross-generator transfer within a single domain is the clearest next step.</w:t>
+        <w:t>Our results give a nuanced answer to the motivating question. Making a detector ignore function words is free in-distribution, yields a provable invariance and the best robustness to text attacks, and produces explanations that are content-only by construction — in contrast to post-hoc, surrogate-based explanations. The cost is cross-domain transfer: when the content vocabulary changes, function-word and stylistic regularities that the constrained model discards turn out to carry domain-general signal. Practically, hard masking is attractive where robustness, auditability and a guarantee matter and the domain is fixed; the unconstrained or soft model is preferable for open-domain transfer. Limitations: English only; a single in-domain generator (GPT-4), so cross-generator evidence comes from a benchmark that also shifts domain; and a modest in-domain set. Isolating cross-generator transfer within a single domain is the clearest next step.</w:t>
       </w:r>
     </w:p>
     <w:p>

</xml_diff>